<commit_message>
feat(contratos): correcciones a templates de cobertura y deploy prod de apps de contratos
- Templates cobertura_inrexsa: correcciones de contenido detectadas al
  probar la generacion (4 docx de placas particulares/comerciales,
  singular y plural)
- deploy-prod.yaml: se agregan backend-2 (cci/backend, contexto raiz),
  legal-documents (cci/legal-documents) y legal-docs-blueprints al
  workflow de produccion. Blueprints no construye imagen: Coolify
  buildea del repo y solo se dispara su webhook de redeploy
- legal-docs-blueprints: script docker:gotenberg para levantar solo
  Gotenberg (localhost:3030) y correr la API en dev

Co-Authored-By: Claude Fable 5 <noreply@anthropic.com>
</commit_message>
<xml_diff>
--- a/apps/legal-docs-blueprints/templates/cobertura_inrexsa/CARTA_COBERTURA_PLACAS_COMERCIALES.docx
+++ b/apps/legal-docs-blueprints/templates/cobertura_inrexsa/CARTA_COBERTURA_PLACAS_COMERCIALES.docx
@@ -1323,7 +1323,7 @@
       </w:pPr>
       <w:r>
         <w:drawing>
-          <wp:anchor distT="0" distB="0" distL="0" distR="0" simplePos="0" relativeHeight="14" behindDoc="1" locked="0" layoutInCell="0" allowOverlap="1">
+          <wp:anchor distT="0" distB="0" distL="0" distR="0" simplePos="0" relativeHeight="12" behindDoc="1" locked="0" layoutInCell="0" allowOverlap="1">
             <wp:simplePos x="0" y="0"/>
             <wp:positionH relativeFrom="margin">
               <wp:posOffset>4411980</wp:posOffset>
@@ -3109,27 +3109,20 @@
       </w:r>
       <w:r>
         <w:rPr>
-          <w:u w:val="single"/>
+          <w:u w:val="none"/>
           <w:lang w:val="es-MX"/>
         </w:rPr>
-        <w:t>{nombreCompleto}</w:t>
-      </w:r>
-      <w:r>
-        <w:rPr>
-          <w:u w:val="single"/>
+        <w:t xml:space="preserve">{nombreCompleto} </w:t>
+      </w:r>
+      <w:r>
+        <w:rPr>
           <w:lang w:val="es-MX"/>
         </w:rPr>
-        <w:t xml:space="preserve"> </w:t>
-      </w:r>
-      <w:r>
-        <w:rPr>
-          <w:lang w:val="es-MX"/>
-        </w:rPr>
         <w:t xml:space="preserve">  Fecha: </w:t>
       </w:r>
       <w:r>
         <w:rPr>
-          <w:u w:val="single"/>
+          <w:u w:val="none"/>
           <w:lang w:val="es-MX"/>
         </w:rPr>
         <w:t>Guatemala, {diaTexto} de {mesTexto} de dos mil {anoTexto}.</w:t>
@@ -4373,18 +4366,6 @@
         <w:contextualSpacing w:val="false"/>
         <w:jc w:val="both"/>
         <w:rPr/>
-        <w:sectPr>
-          <w:headerReference w:type="even" r:id="rId5"/>
-          <w:headerReference w:type="default" r:id="rId6"/>
-          <w:headerReference w:type="first" r:id="rId7"/>
-          <w:type w:val="nextPage"/>
-          <w:pgSz w:w="12240" w:h="15840"/>
-          <w:pgMar w:left="1800" w:right="1440" w:gutter="0" w:header="720" w:top="1340" w:footer="0" w:bottom="280"/>
-          <w:pgNumType w:fmt="decimal"/>
-          <w:formProt w:val="false"/>
-          <w:textDirection w:val="lrTb"/>
-          <w:docGrid w:type="default" w:linePitch="100" w:charSpace="0"/>
-        </w:sectPr>
       </w:pPr>
       <w:r>
         <w:rPr/>
@@ -5022,9 +5003,10 @@
         <w:tabs>
           <w:tab w:val="clear" w:pos="708"/>
           <w:tab w:val="left" w:pos="619" w:leader="none"/>
-        </w:tabs>
-        <w:spacing w:lineRule="auto" w:line="240" w:before="78" w:after="0"/>
-        <w:ind w:hanging="358" w:start="619"/>
+          <w:tab w:val="left" w:pos="621" w:leader="none"/>
+        </w:tabs>
+        <w:spacing w:before="0" w:after="160"/>
+        <w:ind w:hanging="360" w:start="621" w:end="252"/>
         <w:contextualSpacing w:val="false"/>
         <w:jc w:val="both"/>
         <w:rPr/>
@@ -6414,17 +6396,6 @@
         <w:contextualSpacing w:val="false"/>
         <w:jc w:val="both"/>
         <w:rPr/>
-        <w:sectPr>
-          <w:headerReference w:type="default" r:id="rId8"/>
-          <w:headerReference w:type="first" r:id="rId9"/>
-          <w:type w:val="nextPage"/>
-          <w:pgSz w:w="12240" w:h="15840"/>
-          <w:pgMar w:left="1800" w:right="1440" w:gutter="0" w:header="720" w:top="1340" w:footer="0" w:bottom="280"/>
-          <w:pgNumType w:fmt="decimal"/>
-          <w:formProt w:val="false"/>
-          <w:textDirection w:val="lrTb"/>
-          <w:docGrid w:type="default" w:linePitch="100" w:charSpace="0"/>
-        </w:sectPr>
       </w:pPr>
       <w:r>
         <w:rPr/>
@@ -6564,8 +6535,8 @@
           <w:tab w:val="left" w:pos="619" w:leader="none"/>
           <w:tab w:val="left" w:pos="621" w:leader="none"/>
         </w:tabs>
-        <w:spacing w:before="78" w:after="0"/>
-        <w:ind w:hanging="360" w:start="621" w:end="257"/>
+        <w:spacing w:lineRule="auto" w:line="257" w:before="0" w:after="160"/>
+        <w:ind w:hanging="360" w:start="621" w:end="255"/>
         <w:contextualSpacing w:val="false"/>
         <w:jc w:val="both"/>
         <w:rPr/>
@@ -7725,20 +7696,20 @@
       </w:r>
       <w:r>
         <w:rPr>
-          <w:u w:val="single"/>
+          <w:u w:val="none"/>
           <w:lang w:val="es-MX"/>
         </w:rPr>
-        <w:t>{nombreCompleto}</w:t>
+        <w:t xml:space="preserve">{nombreCompleto}  </w:t>
       </w:r>
       <w:r>
         <w:rPr>
           <w:lang w:val="es-MX"/>
         </w:rPr>
-        <w:t xml:space="preserve">   Fecha: </w:t>
-      </w:r>
-      <w:r>
-        <w:rPr>
-          <w:u w:val="single"/>
+        <w:t xml:space="preserve"> Fecha: </w:t>
+      </w:r>
+      <w:r>
+        <w:rPr>
+          <w:u w:val="none"/>
           <w:lang w:val="es-MX"/>
         </w:rPr>
         <w:t>Guatemala, {diaTexto} de {mesTexto} de dos mil {anoTexto}.</w:t>
@@ -7819,156 +7790,19 @@
       </w:r>
     </w:p>
     <w:sectPr>
-      <w:headerReference w:type="even" r:id="rId10"/>
-      <w:headerReference w:type="default" r:id="rId11"/>
-      <w:headerReference w:type="first" r:id="rId12"/>
-      <w:footerReference w:type="even" r:id="rId13"/>
-      <w:footerReference w:type="default" r:id="rId14"/>
-      <w:footerReference w:type="first" r:id="rId15"/>
+      <w:headerReference w:type="even" r:id="rId5"/>
+      <w:headerReference w:type="default" r:id="rId6"/>
+      <w:headerReference w:type="first" r:id="rId7"/>
       <w:type w:val="nextPage"/>
-      <w:pgSz w:w="12240" w:h="18002"/>
-      <w:pgMar w:left="720" w:right="720" w:gutter="0" w:header="708" w:top="765" w:footer="708" w:bottom="765"/>
+      <w:pgSz w:w="12240" w:h="15840"/>
+      <w:pgMar w:left="1800" w:right="1440" w:gutter="0" w:header="720" w:top="1340" w:footer="0" w:bottom="280"/>
       <w:pgNumType w:fmt="decimal"/>
       <w:formProt w:val="false"/>
       <w:textDirection w:val="lrTb"/>
-      <w:docGrid w:type="default" w:linePitch="360" w:charSpace="0"/>
+      <w:docGrid w:type="default" w:linePitch="100" w:charSpace="0"/>
     </w:sectPr>
   </w:body>
 </w:document>
-</file>
-
-<file path=word/footer1.xml><?xml version="1.0" encoding="utf-8"?>
-<w:ftr xmlns:o="urn:schemas-microsoft-com:office:office" xmlns:r="http://schemas.openxmlformats.org/officeDocument/2006/relationships" xmlns:v="urn:schemas-microsoft-com:vml" xmlns:w="http://schemas.openxmlformats.org/wordprocessingml/2006/main" xmlns:w10="urn:schemas-microsoft-com:office:word" xmlns:wp="http://schemas.openxmlformats.org/drawingml/2006/wordprocessingDrawing" xmlns:pic="http://schemas.openxmlformats.org/drawingml/2006/picture" xmlns:wps="http://schemas.microsoft.com/office/word/2010/wordprocessingShape" xmlns:wpg="http://schemas.microsoft.com/office/word/2010/wordprocessingGroup" xmlns:mc="http://schemas.openxmlformats.org/markup-compatibility/2006" xmlns:wp14="http://schemas.microsoft.com/office/word/2010/wordprocessingDrawing" xmlns:w14="http://schemas.microsoft.com/office/word/2010/wordml" xmlns:w15="http://schemas.microsoft.com/office/word/2012/wordml" mc:Ignorable="w14 wp14 w15">
-  <w:p>
-    <w:pPr>
-      <w:pStyle w:val="Footer"/>
-      <w:rPr/>
-    </w:pPr>
-    <w:r>
-      <w:rPr/>
-    </w:r>
-  </w:p>
-</w:ftr>
-</file>
-
-<file path=word/footer2.xml><?xml version="1.0" encoding="utf-8"?>
-<w:ftr xmlns:o="urn:schemas-microsoft-com:office:office" xmlns:r="http://schemas.openxmlformats.org/officeDocument/2006/relationships" xmlns:v="urn:schemas-microsoft-com:vml" xmlns:w="http://schemas.openxmlformats.org/wordprocessingml/2006/main" xmlns:w10="urn:schemas-microsoft-com:office:word" xmlns:wp="http://schemas.openxmlformats.org/drawingml/2006/wordprocessingDrawing" xmlns:pic="http://schemas.openxmlformats.org/drawingml/2006/picture" xmlns:wps="http://schemas.microsoft.com/office/word/2010/wordprocessingShape" xmlns:wpg="http://schemas.microsoft.com/office/word/2010/wordprocessingGroup" xmlns:mc="http://schemas.openxmlformats.org/markup-compatibility/2006" xmlns:wp14="http://schemas.microsoft.com/office/word/2010/wordprocessingDrawing" xmlns:w14="http://schemas.microsoft.com/office/word/2010/wordml" xmlns:w15="http://schemas.microsoft.com/office/word/2012/wordml" mc:Ignorable="w14 wp14 w15">
-  <w:p>
-    <w:pPr>
-      <w:pStyle w:val="Footer"/>
-      <w:rPr/>
-    </w:pPr>
-    <w:r>
-      <w:rPr/>
-      <w:drawing>
-        <wp:anchor distT="0" distB="0" distL="0" distR="0" simplePos="0" relativeHeight="12" behindDoc="1" locked="0" layoutInCell="0" allowOverlap="1">
-          <wp:simplePos x="0" y="0"/>
-          <wp:positionH relativeFrom="page">
-            <wp:align>left</wp:align>
-          </wp:positionH>
-          <wp:positionV relativeFrom="paragraph">
-            <wp:posOffset>7620</wp:posOffset>
-          </wp:positionV>
-          <wp:extent cx="7829550" cy="742950"/>
-          <wp:effectExtent l="0" t="0" r="0" b="0"/>
-          <wp:wrapNone/>
-          <wp:docPr id="12" name="image3.jpg"/>
-          <wp:cNvGraphicFramePr>
-            <a:graphicFrameLocks xmlns:a="http://schemas.openxmlformats.org/drawingml/2006/main" noChangeAspect="1"/>
-          </wp:cNvGraphicFramePr>
-          <a:graphic xmlns:a="http://schemas.openxmlformats.org/drawingml/2006/main">
-            <a:graphicData uri="http://schemas.openxmlformats.org/drawingml/2006/picture">
-              <pic:pic xmlns:pic="http://schemas.openxmlformats.org/drawingml/2006/picture">
-                <pic:nvPicPr>
-                  <pic:cNvPr id="12" name="image3.jpg"/>
-                  <pic:cNvPicPr>
-                    <a:picLocks noChangeAspect="1" noChangeArrowheads="1"/>
-                  </pic:cNvPicPr>
-                </pic:nvPicPr>
-                <pic:blipFill>
-                  <a:blip r:embed="rId1"/>
-                  <a:stretch>
-                    <a:fillRect/>
-                  </a:stretch>
-                </pic:blipFill>
-                <pic:spPr bwMode="auto">
-                  <a:xfrm>
-                    <a:off x="0" y="0"/>
-                    <a:ext cx="7829550" cy="742950"/>
-                  </a:xfrm>
-                  <a:prstGeom prst="rect">
-                    <a:avLst/>
-                  </a:prstGeom>
-                  <a:noFill/>
-                </pic:spPr>
-              </pic:pic>
-            </a:graphicData>
-          </a:graphic>
-        </wp:anchor>
-      </w:drawing>
-    </w:r>
-  </w:p>
-</w:ftr>
-</file>
-
-<file path=word/footer3.xml><?xml version="1.0" encoding="utf-8"?>
-<w:ftr xmlns:o="urn:schemas-microsoft-com:office:office" xmlns:r="http://schemas.openxmlformats.org/officeDocument/2006/relationships" xmlns:v="urn:schemas-microsoft-com:vml" xmlns:w="http://schemas.openxmlformats.org/wordprocessingml/2006/main" xmlns:w10="urn:schemas-microsoft-com:office:word" xmlns:wp="http://schemas.openxmlformats.org/drawingml/2006/wordprocessingDrawing" xmlns:pic="http://schemas.openxmlformats.org/drawingml/2006/picture" xmlns:wps="http://schemas.microsoft.com/office/word/2010/wordprocessingShape" xmlns:wpg="http://schemas.microsoft.com/office/word/2010/wordprocessingGroup" xmlns:mc="http://schemas.openxmlformats.org/markup-compatibility/2006" xmlns:wp14="http://schemas.microsoft.com/office/word/2010/wordprocessingDrawing" xmlns:w14="http://schemas.microsoft.com/office/word/2010/wordml" xmlns:w15="http://schemas.microsoft.com/office/word/2012/wordml" mc:Ignorable="w14 wp14 w15">
-  <w:p>
-    <w:pPr>
-      <w:pStyle w:val="Footer"/>
-      <w:rPr/>
-    </w:pPr>
-    <w:r>
-      <w:rPr/>
-      <w:drawing>
-        <wp:anchor distT="0" distB="0" distL="0" distR="0" simplePos="0" relativeHeight="12" behindDoc="1" locked="0" layoutInCell="0" allowOverlap="1">
-          <wp:simplePos x="0" y="0"/>
-          <wp:positionH relativeFrom="page">
-            <wp:align>left</wp:align>
-          </wp:positionH>
-          <wp:positionV relativeFrom="paragraph">
-            <wp:posOffset>7620</wp:posOffset>
-          </wp:positionV>
-          <wp:extent cx="7829550" cy="742950"/>
-          <wp:effectExtent l="0" t="0" r="0" b="0"/>
-          <wp:wrapNone/>
-          <wp:docPr id="13" name="image3.jpg"/>
-          <wp:cNvGraphicFramePr>
-            <a:graphicFrameLocks xmlns:a="http://schemas.openxmlformats.org/drawingml/2006/main" noChangeAspect="1"/>
-          </wp:cNvGraphicFramePr>
-          <a:graphic xmlns:a="http://schemas.openxmlformats.org/drawingml/2006/main">
-            <a:graphicData uri="http://schemas.openxmlformats.org/drawingml/2006/picture">
-              <pic:pic xmlns:pic="http://schemas.openxmlformats.org/drawingml/2006/picture">
-                <pic:nvPicPr>
-                  <pic:cNvPr id="13" name="image3.jpg"/>
-                  <pic:cNvPicPr>
-                    <a:picLocks noChangeAspect="1" noChangeArrowheads="1"/>
-                  </pic:cNvPicPr>
-                </pic:nvPicPr>
-                <pic:blipFill>
-                  <a:blip r:embed="rId1"/>
-                  <a:stretch>
-                    <a:fillRect/>
-                  </a:stretch>
-                </pic:blipFill>
-                <pic:spPr bwMode="auto">
-                  <a:xfrm>
-                    <a:off x="0" y="0"/>
-                    <a:ext cx="7829550" cy="742950"/>
-                  </a:xfrm>
-                  <a:prstGeom prst="rect">
-                    <a:avLst/>
-                  </a:prstGeom>
-                  <a:noFill/>
-                </pic:spPr>
-              </pic:pic>
-            </a:graphicData>
-          </a:graphic>
-        </wp:anchor>
-      </w:drawing>
-    </w:r>
-  </w:p>
-</w:ftr>
 </file>
 
 <file path=word/header1.xml><?xml version="1.0" encoding="utf-8"?>
@@ -8178,349 +8012,6 @@
           </a:graphic>
         </wp:inline>
       </w:drawing>
-    </w:r>
-  </w:p>
-</w:hdr>
-</file>
-
-<file path=word/header4.xml><?xml version="1.0" encoding="utf-8"?>
-<w:hdr xmlns:o="urn:schemas-microsoft-com:office:office" xmlns:r="http://schemas.openxmlformats.org/officeDocument/2006/relationships" xmlns:v="urn:schemas-microsoft-com:vml" xmlns:w="http://schemas.openxmlformats.org/wordprocessingml/2006/main" xmlns:w10="urn:schemas-microsoft-com:office:word" xmlns:wp="http://schemas.openxmlformats.org/drawingml/2006/wordprocessingDrawing" xmlns:pic="http://schemas.openxmlformats.org/drawingml/2006/picture" xmlns:wps="http://schemas.microsoft.com/office/word/2010/wordprocessingShape" xmlns:wpg="http://schemas.microsoft.com/office/word/2010/wordprocessingGroup" xmlns:mc="http://schemas.openxmlformats.org/markup-compatibility/2006" xmlns:wp14="http://schemas.microsoft.com/office/word/2010/wordprocessingDrawing" xmlns:w14="http://schemas.microsoft.com/office/word/2010/wordml" xmlns:w15="http://schemas.microsoft.com/office/word/2012/wordml" mc:Ignorable="w14 wp14 w15">
-  <w:p>
-    <w:pPr>
-      <w:pStyle w:val="Header"/>
-      <w:rPr/>
-    </w:pPr>
-    <w:r>
-      <w:rPr/>
-      <w:drawing>
-        <wp:inline distT="0" distB="0" distL="0" distR="0">
-          <wp:extent cx="2057400" cy="625475"/>
-          <wp:effectExtent l="0" t="0" r="0" b="0"/>
-          <wp:docPr id="6" name="Imagen2 Copia 1"/>
-          <wp:cNvGraphicFramePr>
-            <a:graphicFrameLocks xmlns:a="http://schemas.openxmlformats.org/drawingml/2006/main" noChangeAspect="1"/>
-          </wp:cNvGraphicFramePr>
-          <a:graphic xmlns:a="http://schemas.openxmlformats.org/drawingml/2006/main">
-            <a:graphicData uri="http://schemas.openxmlformats.org/drawingml/2006/picture">
-              <pic:pic xmlns:pic="http://schemas.openxmlformats.org/drawingml/2006/picture">
-                <pic:nvPicPr>
-                  <pic:cNvPr id="6" name="Imagen2 Copia 1"/>
-                  <pic:cNvPicPr>
-                    <a:picLocks noChangeAspect="1" noChangeArrowheads="1"/>
-                  </pic:cNvPicPr>
-                </pic:nvPicPr>
-                <pic:blipFill>
-                  <a:blip r:embed="rId1"/>
-                  <a:srcRect l="6569" t="33067" r="4648" b="33266"/>
-                  <a:stretch>
-                    <a:fillRect/>
-                  </a:stretch>
-                </pic:blipFill>
-                <pic:spPr bwMode="auto">
-                  <a:xfrm>
-                    <a:off x="0" y="0"/>
-                    <a:ext cx="2057400" cy="625475"/>
-                  </a:xfrm>
-                  <a:prstGeom prst="rect">
-                    <a:avLst/>
-                  </a:prstGeom>
-                  <a:noFill/>
-                </pic:spPr>
-              </pic:pic>
-            </a:graphicData>
-          </a:graphic>
-        </wp:inline>
-      </w:drawing>
-    </w:r>
-    <w:r>
-      <w:rPr/>
-      <w:tab/>
-      <w:tab/>
-    </w:r>
-    <w:r>
-      <w:rPr/>
-      <w:drawing>
-        <wp:inline distT="0" distB="0" distL="0" distR="0">
-          <wp:extent cx="1844040" cy="594360"/>
-          <wp:effectExtent l="0" t="0" r="0" b="0"/>
-          <wp:docPr id="7" name="Imagen 1 Copia 1"/>
-          <wp:cNvGraphicFramePr>
-            <a:graphicFrameLocks xmlns:a="http://schemas.openxmlformats.org/drawingml/2006/main" noChangeAspect="1"/>
-          </wp:cNvGraphicFramePr>
-          <a:graphic xmlns:a="http://schemas.openxmlformats.org/drawingml/2006/main">
-            <a:graphicData uri="http://schemas.openxmlformats.org/drawingml/2006/picture">
-              <pic:pic xmlns:pic="http://schemas.openxmlformats.org/drawingml/2006/picture">
-                <pic:nvPicPr>
-                  <pic:cNvPr id="7" name="Imagen 1 Copia 1"/>
-                  <pic:cNvPicPr>
-                    <a:picLocks noChangeAspect="1" noChangeArrowheads="1"/>
-                  </pic:cNvPicPr>
-                </pic:nvPicPr>
-                <pic:blipFill>
-                  <a:blip r:embed="rId2"/>
-                  <a:stretch>
-                    <a:fillRect/>
-                  </a:stretch>
-                </pic:blipFill>
-                <pic:spPr bwMode="auto">
-                  <a:xfrm>
-                    <a:off x="0" y="0"/>
-                    <a:ext cx="1844040" cy="594360"/>
-                  </a:xfrm>
-                  <a:prstGeom prst="rect">
-                    <a:avLst/>
-                  </a:prstGeom>
-                  <a:noFill/>
-                </pic:spPr>
-              </pic:pic>
-            </a:graphicData>
-          </a:graphic>
-        </wp:inline>
-      </w:drawing>
-    </w:r>
-  </w:p>
-</w:hdr>
-</file>
-
-<file path=word/header5.xml><?xml version="1.0" encoding="utf-8"?>
-<w:hdr xmlns:o="urn:schemas-microsoft-com:office:office" xmlns:r="http://schemas.openxmlformats.org/officeDocument/2006/relationships" xmlns:v="urn:schemas-microsoft-com:vml" xmlns:w="http://schemas.openxmlformats.org/wordprocessingml/2006/main" xmlns:w10="urn:schemas-microsoft-com:office:word" xmlns:wp="http://schemas.openxmlformats.org/drawingml/2006/wordprocessingDrawing" xmlns:pic="http://schemas.openxmlformats.org/drawingml/2006/picture" xmlns:wps="http://schemas.microsoft.com/office/word/2010/wordprocessingShape" xmlns:wpg="http://schemas.microsoft.com/office/word/2010/wordprocessingGroup" xmlns:mc="http://schemas.openxmlformats.org/markup-compatibility/2006" xmlns:wp14="http://schemas.microsoft.com/office/word/2010/wordprocessingDrawing" xmlns:w14="http://schemas.microsoft.com/office/word/2010/wordml" xmlns:w15="http://schemas.microsoft.com/office/word/2012/wordml" mc:Ignorable="w14 wp14 w15">
-  <w:p/>
-</w:hdr>
-</file>
-
-<file path=word/header6.xml><?xml version="1.0" encoding="utf-8"?>
-<w:hdr xmlns:o="urn:schemas-microsoft-com:office:office" xmlns:r="http://schemas.openxmlformats.org/officeDocument/2006/relationships" xmlns:v="urn:schemas-microsoft-com:vml" xmlns:w="http://schemas.openxmlformats.org/wordprocessingml/2006/main" xmlns:w10="urn:schemas-microsoft-com:office:word" xmlns:wp="http://schemas.openxmlformats.org/drawingml/2006/wordprocessingDrawing" xmlns:pic="http://schemas.openxmlformats.org/drawingml/2006/picture" xmlns:wps="http://schemas.microsoft.com/office/word/2010/wordprocessingShape" xmlns:wpg="http://schemas.microsoft.com/office/word/2010/wordprocessingGroup" xmlns:mc="http://schemas.openxmlformats.org/markup-compatibility/2006" xmlns:wp14="http://schemas.microsoft.com/office/word/2010/wordprocessingDrawing" xmlns:w14="http://schemas.microsoft.com/office/word/2010/wordml" xmlns:w15="http://schemas.microsoft.com/office/word/2012/wordml" mc:Ignorable="w14 wp14 w15">
-  <w:p>
-    <w:pPr>
-      <w:pStyle w:val="Header"/>
-      <w:rPr/>
-    </w:pPr>
-    <w:r>
-      <w:rPr/>
-    </w:r>
-  </w:p>
-</w:hdr>
-</file>
-
-<file path=word/header7.xml><?xml version="1.0" encoding="utf-8"?>
-<w:hdr xmlns:o="urn:schemas-microsoft-com:office:office" xmlns:r="http://schemas.openxmlformats.org/officeDocument/2006/relationships" xmlns:v="urn:schemas-microsoft-com:vml" xmlns:w="http://schemas.openxmlformats.org/wordprocessingml/2006/main" xmlns:w10="urn:schemas-microsoft-com:office:word" xmlns:wp="http://schemas.openxmlformats.org/drawingml/2006/wordprocessingDrawing" xmlns:pic="http://schemas.openxmlformats.org/drawingml/2006/picture" xmlns:wps="http://schemas.microsoft.com/office/word/2010/wordprocessingShape" xmlns:wpg="http://schemas.microsoft.com/office/word/2010/wordprocessingGroup" xmlns:mc="http://schemas.openxmlformats.org/markup-compatibility/2006" xmlns:wp14="http://schemas.microsoft.com/office/word/2010/wordprocessingDrawing" xmlns:w14="http://schemas.microsoft.com/office/word/2010/wordml" xmlns:w15="http://schemas.microsoft.com/office/word/2012/wordml" mc:Ignorable="w14 wp14 w15">
-  <w:p>
-    <w:pPr>
-      <w:pStyle w:val="Header"/>
-      <w:rPr/>
-    </w:pPr>
-    <w:r>
-      <w:rPr>
-        <w:lang w:val="en-US"/>
-      </w:rPr>
-      <w:t xml:space="preserve">   </w:t>
-    </w:r>
-    <w:r>
-      <w:rPr/>
-      <w:drawing>
-        <wp:inline distT="0" distB="0" distL="0" distR="0">
-          <wp:extent cx="2057400" cy="625475"/>
-          <wp:effectExtent l="0" t="0" r="0" b="0"/>
-          <wp:docPr id="8" name="Imagen4"/>
-          <wp:cNvGraphicFramePr>
-            <a:graphicFrameLocks xmlns:a="http://schemas.openxmlformats.org/drawingml/2006/main" noChangeAspect="1"/>
-          </wp:cNvGraphicFramePr>
-          <a:graphic xmlns:a="http://schemas.openxmlformats.org/drawingml/2006/main">
-            <a:graphicData uri="http://schemas.openxmlformats.org/drawingml/2006/picture">
-              <pic:pic xmlns:pic="http://schemas.openxmlformats.org/drawingml/2006/picture">
-                <pic:nvPicPr>
-                  <pic:cNvPr id="8" name="Imagen4"/>
-                  <pic:cNvPicPr>
-                    <a:picLocks noChangeAspect="1" noChangeArrowheads="1"/>
-                  </pic:cNvPicPr>
-                </pic:nvPicPr>
-                <pic:blipFill>
-                  <a:blip r:embed="rId1"/>
-                  <a:srcRect l="6569" t="33067" r="4648" b="33266"/>
-                  <a:stretch>
-                    <a:fillRect/>
-                  </a:stretch>
-                </pic:blipFill>
-                <pic:spPr bwMode="auto">
-                  <a:xfrm>
-                    <a:off x="0" y="0"/>
-                    <a:ext cx="2057400" cy="625475"/>
-                  </a:xfrm>
-                  <a:prstGeom prst="rect">
-                    <a:avLst/>
-                  </a:prstGeom>
-                  <a:noFill/>
-                </pic:spPr>
-              </pic:pic>
-            </a:graphicData>
-          </a:graphic>
-        </wp:inline>
-      </w:drawing>
-    </w:r>
-    <w:r>
-      <w:rPr>
-        <w:lang w:val="en-US"/>
-      </w:rPr>
-      <w:t xml:space="preserve">                                                            </w:t>
-    </w:r>
-    <w:r>
-      <w:rPr/>
-      <w:drawing>
-        <wp:inline distT="0" distB="0" distL="0" distR="0">
-          <wp:extent cx="1844040" cy="594360"/>
-          <wp:effectExtent l="0" t="0" r="0" b="0"/>
-          <wp:docPr id="9" name="Imagen5"/>
-          <wp:cNvGraphicFramePr>
-            <a:graphicFrameLocks xmlns:a="http://schemas.openxmlformats.org/drawingml/2006/main" noChangeAspect="1"/>
-          </wp:cNvGraphicFramePr>
-          <a:graphic xmlns:a="http://schemas.openxmlformats.org/drawingml/2006/main">
-            <a:graphicData uri="http://schemas.openxmlformats.org/drawingml/2006/picture">
-              <pic:pic xmlns:pic="http://schemas.openxmlformats.org/drawingml/2006/picture">
-                <pic:nvPicPr>
-                  <pic:cNvPr id="9" name="Imagen5"/>
-                  <pic:cNvPicPr>
-                    <a:picLocks noChangeAspect="1" noChangeArrowheads="1"/>
-                  </pic:cNvPicPr>
-                </pic:nvPicPr>
-                <pic:blipFill>
-                  <a:blip r:embed="rId2"/>
-                  <a:stretch>
-                    <a:fillRect/>
-                  </a:stretch>
-                </pic:blipFill>
-                <pic:spPr bwMode="auto">
-                  <a:xfrm>
-                    <a:off x="0" y="0"/>
-                    <a:ext cx="1844040" cy="594360"/>
-                  </a:xfrm>
-                  <a:prstGeom prst="rect">
-                    <a:avLst/>
-                  </a:prstGeom>
-                  <a:noFill/>
-                </pic:spPr>
-              </pic:pic>
-            </a:graphicData>
-          </a:graphic>
-        </wp:inline>
-      </w:drawing>
-    </w:r>
-    <w:r>
-      <w:rPr>
-        <w:lang w:val="en-US"/>
-      </w:rPr>
-      <w:t xml:space="preserve">                              </w:t>
-    </w:r>
-  </w:p>
-</w:hdr>
-</file>
-
-<file path=word/header8.xml><?xml version="1.0" encoding="utf-8"?>
-<w:hdr xmlns:o="urn:schemas-microsoft-com:office:office" xmlns:r="http://schemas.openxmlformats.org/officeDocument/2006/relationships" xmlns:v="urn:schemas-microsoft-com:vml" xmlns:w="http://schemas.openxmlformats.org/wordprocessingml/2006/main" xmlns:w10="urn:schemas-microsoft-com:office:word" xmlns:wp="http://schemas.openxmlformats.org/drawingml/2006/wordprocessingDrawing" xmlns:pic="http://schemas.openxmlformats.org/drawingml/2006/picture" xmlns:wps="http://schemas.microsoft.com/office/word/2010/wordprocessingShape" xmlns:wpg="http://schemas.microsoft.com/office/word/2010/wordprocessingGroup" xmlns:mc="http://schemas.openxmlformats.org/markup-compatibility/2006" xmlns:wp14="http://schemas.microsoft.com/office/word/2010/wordprocessingDrawing" xmlns:w14="http://schemas.microsoft.com/office/word/2010/wordml" xmlns:w15="http://schemas.microsoft.com/office/word/2012/wordml" mc:Ignorable="w14 wp14 w15">
-  <w:p>
-    <w:pPr>
-      <w:pStyle w:val="Header"/>
-      <w:rPr/>
-    </w:pPr>
-    <w:r>
-      <w:rPr>
-        <w:lang w:val="en-US"/>
-      </w:rPr>
-      <w:t xml:space="preserve">   </w:t>
-    </w:r>
-    <w:r>
-      <w:rPr/>
-      <w:drawing>
-        <wp:inline distT="0" distB="0" distL="0" distR="0">
-          <wp:extent cx="2057400" cy="625475"/>
-          <wp:effectExtent l="0" t="0" r="0" b="0"/>
-          <wp:docPr id="10" name="Imagen4"/>
-          <wp:cNvGraphicFramePr>
-            <a:graphicFrameLocks xmlns:a="http://schemas.openxmlformats.org/drawingml/2006/main" noChangeAspect="1"/>
-          </wp:cNvGraphicFramePr>
-          <a:graphic xmlns:a="http://schemas.openxmlformats.org/drawingml/2006/main">
-            <a:graphicData uri="http://schemas.openxmlformats.org/drawingml/2006/picture">
-              <pic:pic xmlns:pic="http://schemas.openxmlformats.org/drawingml/2006/picture">
-                <pic:nvPicPr>
-                  <pic:cNvPr id="10" name="Imagen4"/>
-                  <pic:cNvPicPr>
-                    <a:picLocks noChangeAspect="1" noChangeArrowheads="1"/>
-                  </pic:cNvPicPr>
-                </pic:nvPicPr>
-                <pic:blipFill>
-                  <a:blip r:embed="rId1"/>
-                  <a:srcRect l="6569" t="33067" r="4648" b="33266"/>
-                  <a:stretch>
-                    <a:fillRect/>
-                  </a:stretch>
-                </pic:blipFill>
-                <pic:spPr bwMode="auto">
-                  <a:xfrm>
-                    <a:off x="0" y="0"/>
-                    <a:ext cx="2057400" cy="625475"/>
-                  </a:xfrm>
-                  <a:prstGeom prst="rect">
-                    <a:avLst/>
-                  </a:prstGeom>
-                  <a:noFill/>
-                </pic:spPr>
-              </pic:pic>
-            </a:graphicData>
-          </a:graphic>
-        </wp:inline>
-      </w:drawing>
-    </w:r>
-    <w:r>
-      <w:rPr>
-        <w:lang w:val="en-US"/>
-      </w:rPr>
-      <w:t xml:space="preserve">                                                            </w:t>
-    </w:r>
-    <w:r>
-      <w:rPr/>
-      <w:drawing>
-        <wp:inline distT="0" distB="0" distL="0" distR="0">
-          <wp:extent cx="1844040" cy="594360"/>
-          <wp:effectExtent l="0" t="0" r="0" b="0"/>
-          <wp:docPr id="11" name="Imagen5"/>
-          <wp:cNvGraphicFramePr>
-            <a:graphicFrameLocks xmlns:a="http://schemas.openxmlformats.org/drawingml/2006/main" noChangeAspect="1"/>
-          </wp:cNvGraphicFramePr>
-          <a:graphic xmlns:a="http://schemas.openxmlformats.org/drawingml/2006/main">
-            <a:graphicData uri="http://schemas.openxmlformats.org/drawingml/2006/picture">
-              <pic:pic xmlns:pic="http://schemas.openxmlformats.org/drawingml/2006/picture">
-                <pic:nvPicPr>
-                  <pic:cNvPr id="11" name="Imagen5"/>
-                  <pic:cNvPicPr>
-                    <a:picLocks noChangeAspect="1" noChangeArrowheads="1"/>
-                  </pic:cNvPicPr>
-                </pic:nvPicPr>
-                <pic:blipFill>
-                  <a:blip r:embed="rId2"/>
-                  <a:stretch>
-                    <a:fillRect/>
-                  </a:stretch>
-                </pic:blipFill>
-                <pic:spPr bwMode="auto">
-                  <a:xfrm>
-                    <a:off x="0" y="0"/>
-                    <a:ext cx="1844040" cy="594360"/>
-                  </a:xfrm>
-                  <a:prstGeom prst="rect">
-                    <a:avLst/>
-                  </a:prstGeom>
-                  <a:noFill/>
-                </pic:spPr>
-              </pic:pic>
-            </a:graphicData>
-          </a:graphic>
-        </wp:inline>
-      </w:drawing>
-    </w:r>
-    <w:r>
-      <w:rPr>
-        <w:lang w:val="en-US"/>
-      </w:rPr>
-      <w:t xml:space="preserve">                              </w:t>
     </w:r>
   </w:p>
 </w:hdr>
@@ -9544,6 +9035,7 @@
     <w:qFormat/>
     <w:pPr>
       <w:widowControl/>
+      <w:suppressAutoHyphens w:val="true"/>
       <w:bidi w:val="0"/>
       <w:spacing w:lineRule="auto" w:line="259" w:before="0" w:after="160"/>
       <w:jc w:val="start"/>
@@ -10068,6 +9560,32 @@
       <w:rFonts w:cs="Noto Sans Devanagari"/>
     </w:rPr>
   </w:style>
+  <w:style w:type="paragraph" w:styleId="Ttulouser">
+    <w:name w:val="Título (user)"/>
+    <w:basedOn w:val="Normal"/>
+    <w:next w:val="BodyText"/>
+    <w:qFormat/>
+    <w:pPr>
+      <w:keepNext w:val="true"/>
+      <w:spacing w:before="240" w:after="120"/>
+    </w:pPr>
+    <w:rPr>
+      <w:rFonts w:ascii="Liberation Sans" w:hAnsi="Liberation Sans" w:eastAsia="Noto Sans CJK SC" w:cs="Noto Sans Devanagari"/>
+      <w:sz w:val="28"/>
+      <w:szCs w:val="28"/>
+    </w:rPr>
+  </w:style>
+  <w:style w:type="paragraph" w:styleId="ndiceuser">
+    <w:name w:val="Índice (user)"/>
+    <w:basedOn w:val="Normal"/>
+    <w:qFormat/>
+    <w:pPr>
+      <w:suppressLineNumbers/>
+    </w:pPr>
+    <w:rPr>
+      <w:rFonts w:cs="Noto Sans Devanagari"/>
+    </w:rPr>
+  </w:style>
   <w:style w:type="paragraph" w:styleId="Title">
     <w:name w:val="Title"/>
     <w:basedOn w:val="Normal"/>
@@ -10179,6 +9697,13 @@
   </w:style>
   <w:style w:type="paragraph" w:styleId="Cabeceraypie">
     <w:name w:val="Cabecera y pie"/>
+    <w:basedOn w:val="Normal"/>
+    <w:qFormat/>
+    <w:pPr/>
+    <w:rPr/>
+  </w:style>
+  <w:style w:type="paragraph" w:styleId="Cabeceraypieuser">
+    <w:name w:val="Cabecera y pie (user)"/>
     <w:basedOn w:val="Normal"/>
     <w:qFormat/>
     <w:pPr/>

</xml_diff>